<commit_message>
add reports for labs 1-3
</commit_message>
<xml_diff>
--- a/CRM/lab1/БПС2601 Вахонин Лабораторная №1.docx
+++ b/CRM/lab1/БПС2601 Вахонин Лабораторная №1.docx
@@ -7,6 +7,7 @@
         <w:ind w:firstLine="0"/>
         <w:jc w:val="center"/>
       </w:pPr>
+      <w:bookmarkStart w:id="0" w:name="_Hlk243735744"/>
       <w:r>
         <w:rPr>
           <w:b/>
@@ -149,6 +150,7 @@
         <w:t>Проверил: Игнатов Д.В.</w:t>
       </w:r>
     </w:p>
+    <w:bookmarkEnd w:id="0"/>
     <w:p>
       <w:pPr>
         <w:ind w:firstLine="0"/>
@@ -157,8 +159,8 @@
         <w:br w:type="page"/>
       </w:r>
     </w:p>
-    <w:bookmarkStart w:id="0" w:name="_Toc243697832" w:displacedByCustomXml="next"/>
-    <w:bookmarkStart w:id="1" w:name="_Toc243039469" w:displacedByCustomXml="next"/>
+    <w:bookmarkStart w:id="1" w:name="_Toc243697832" w:displacedByCustomXml="next"/>
+    <w:bookmarkStart w:id="2" w:name="_Toc243039469" w:displacedByCustomXml="next"/>
     <w:sdt>
       <w:sdtPr>
         <w:id w:val="966553266"/>
@@ -176,6 +178,7 @@
       <w:sdtContent>
         <w:p>
           <w:pPr>
+            <w:ind w:firstLine="0"/>
             <w:jc w:val="center"/>
             <w:rPr>
               <w:b/>
@@ -196,6 +199,7 @@
             <w:tabs>
               <w:tab w:val="right" w:leader="dot" w:pos="9345"/>
             </w:tabs>
+            <w:ind w:firstLine="0"/>
             <w:rPr>
               <w:rFonts w:asciiTheme="minorHAnsi" w:eastAsiaTheme="minorEastAsia" w:hAnsiTheme="minorHAnsi" w:cstheme="minorBidi"/>
               <w:noProof/>
@@ -215,7 +219,7 @@
           <w:r>
             <w:fldChar w:fldCharType="separate"/>
           </w:r>
-          <w:hyperlink w:anchor="_Toc243698026" w:history="1">
+          <w:hyperlink w:anchor="_Toc243733829" w:history="1">
             <w:r>
               <w:rPr>
                 <w:rStyle w:val="af0"/>
@@ -250,7 +254,7 @@
                 <w:noProof/>
                 <w:webHidden/>
               </w:rPr>
-              <w:instrText xml:space="preserve"> PAGEREF _Toc243698026 \h </w:instrText>
+              <w:instrText xml:space="preserve"> PAGEREF _Toc243733829 \h </w:instrText>
             </w:r>
             <w:r>
               <w:rPr>
@@ -287,6 +291,7 @@
             <w:tabs>
               <w:tab w:val="right" w:leader="dot" w:pos="9345"/>
             </w:tabs>
+            <w:ind w:firstLine="0"/>
             <w:rPr>
               <w:rFonts w:asciiTheme="minorHAnsi" w:eastAsiaTheme="minorEastAsia" w:hAnsiTheme="minorHAnsi" w:cstheme="minorBidi"/>
               <w:noProof/>
@@ -297,7 +302,7 @@
               <w14:ligatures w14:val="standardContextual"/>
             </w:rPr>
           </w:pPr>
-          <w:hyperlink w:anchor="_Toc243698027" w:history="1">
+          <w:hyperlink w:anchor="_Toc243733830" w:history="1">
             <w:r>
               <w:rPr>
                 <w:rStyle w:val="af0"/>
@@ -324,7 +329,7 @@
                 <w:noProof/>
                 <w:webHidden/>
               </w:rPr>
-              <w:instrText xml:space="preserve"> PAGEREF _Toc243698027 \h </w:instrText>
+              <w:instrText xml:space="preserve"> PAGEREF _Toc243733830 \h </w:instrText>
             </w:r>
             <w:r>
               <w:rPr>
@@ -361,6 +366,7 @@
             <w:tabs>
               <w:tab w:val="right" w:leader="dot" w:pos="9345"/>
             </w:tabs>
+            <w:ind w:firstLine="0"/>
             <w:rPr>
               <w:rFonts w:asciiTheme="minorHAnsi" w:eastAsiaTheme="minorEastAsia" w:hAnsiTheme="minorHAnsi" w:cstheme="minorBidi"/>
               <w:noProof/>
@@ -371,7 +377,7 @@
               <w14:ligatures w14:val="standardContextual"/>
             </w:rPr>
           </w:pPr>
-          <w:hyperlink w:anchor="_Toc243698028" w:history="1">
+          <w:hyperlink w:anchor="_Toc243733831" w:history="1">
             <w:r>
               <w:rPr>
                 <w:rStyle w:val="af0"/>
@@ -398,7 +404,7 @@
                 <w:noProof/>
                 <w:webHidden/>
               </w:rPr>
-              <w:instrText xml:space="preserve"> PAGEREF _Toc243698028 \h </w:instrText>
+              <w:instrText xml:space="preserve"> PAGEREF _Toc243733831 \h </w:instrText>
             </w:r>
             <w:r>
               <w:rPr>
@@ -435,6 +441,7 @@
             <w:tabs>
               <w:tab w:val="right" w:leader="dot" w:pos="9345"/>
             </w:tabs>
+            <w:ind w:firstLine="0"/>
             <w:rPr>
               <w:rFonts w:asciiTheme="minorHAnsi" w:eastAsiaTheme="minorEastAsia" w:hAnsiTheme="minorHAnsi" w:cstheme="minorBidi"/>
               <w:noProof/>
@@ -445,7 +452,7 @@
               <w14:ligatures w14:val="standardContextual"/>
             </w:rPr>
           </w:pPr>
-          <w:hyperlink w:anchor="_Toc243698029" w:history="1">
+          <w:hyperlink w:anchor="_Toc243733832" w:history="1">
             <w:r>
               <w:rPr>
                 <w:rStyle w:val="af0"/>
@@ -473,7 +480,7 @@
                 <w:noProof/>
                 <w:webHidden/>
               </w:rPr>
-              <w:instrText xml:space="preserve"> PAGEREF _Toc243698029 \h </w:instrText>
+              <w:instrText xml:space="preserve"> PAGEREF _Toc243733832 \h </w:instrText>
             </w:r>
             <w:r>
               <w:rPr>
@@ -510,6 +517,7 @@
             <w:tabs>
               <w:tab w:val="right" w:leader="dot" w:pos="9345"/>
             </w:tabs>
+            <w:ind w:firstLine="0"/>
             <w:rPr>
               <w:rFonts w:asciiTheme="minorHAnsi" w:eastAsiaTheme="minorEastAsia" w:hAnsiTheme="minorHAnsi" w:cstheme="minorBidi"/>
               <w:noProof/>
@@ -520,7 +528,7 @@
               <w14:ligatures w14:val="standardContextual"/>
             </w:rPr>
           </w:pPr>
-          <w:hyperlink w:anchor="_Toc243698030" w:history="1">
+          <w:hyperlink w:anchor="_Toc243733833" w:history="1">
             <w:r>
               <w:rPr>
                 <w:rStyle w:val="af0"/>
@@ -547,7 +555,7 @@
                 <w:noProof/>
                 <w:webHidden/>
               </w:rPr>
-              <w:instrText xml:space="preserve"> PAGEREF _Toc243698030 \h </w:instrText>
+              <w:instrText xml:space="preserve"> PAGEREF _Toc243733833 \h </w:instrText>
             </w:r>
             <w:r>
               <w:rPr>
@@ -584,6 +592,7 @@
             <w:tabs>
               <w:tab w:val="right" w:leader="dot" w:pos="9345"/>
             </w:tabs>
+            <w:ind w:firstLine="0"/>
             <w:rPr>
               <w:rFonts w:asciiTheme="minorHAnsi" w:eastAsiaTheme="minorEastAsia" w:hAnsiTheme="minorHAnsi" w:cstheme="minorBidi"/>
               <w:noProof/>
@@ -594,7 +603,7 @@
               <w14:ligatures w14:val="standardContextual"/>
             </w:rPr>
           </w:pPr>
-          <w:hyperlink w:anchor="_Toc243698031" w:history="1">
+          <w:hyperlink w:anchor="_Toc243733834" w:history="1">
             <w:r>
               <w:rPr>
                 <w:rStyle w:val="af0"/>
@@ -621,7 +630,7 @@
                 <w:noProof/>
                 <w:webHidden/>
               </w:rPr>
-              <w:instrText xml:space="preserve"> PAGEREF _Toc243698031 \h </w:instrText>
+              <w:instrText xml:space="preserve"> PAGEREF _Toc243733834 \h </w:instrText>
             </w:r>
             <w:r>
               <w:rPr>
@@ -658,6 +667,7 @@
             <w:tabs>
               <w:tab w:val="right" w:leader="dot" w:pos="9345"/>
             </w:tabs>
+            <w:ind w:firstLine="0"/>
             <w:rPr>
               <w:rFonts w:asciiTheme="minorHAnsi" w:eastAsiaTheme="minorEastAsia" w:hAnsiTheme="minorHAnsi" w:cstheme="minorBidi"/>
               <w:noProof/>
@@ -668,7 +678,7 @@
               <w14:ligatures w14:val="standardContextual"/>
             </w:rPr>
           </w:pPr>
-          <w:hyperlink w:anchor="_Toc243698032" w:history="1">
+          <w:hyperlink w:anchor="_Toc243733835" w:history="1">
             <w:r>
               <w:rPr>
                 <w:rStyle w:val="af0"/>
@@ -695,7 +705,7 @@
                 <w:noProof/>
                 <w:webHidden/>
               </w:rPr>
-              <w:instrText xml:space="preserve"> PAGEREF _Toc243698032 \h </w:instrText>
+              <w:instrText xml:space="preserve"> PAGEREF _Toc243733835 \h </w:instrText>
             </w:r>
             <w:r>
               <w:rPr>
@@ -739,56 +749,49 @@
     </w:sdt>
     <w:p>
       <w:pPr>
+        <w:suppressAutoHyphens w:val="0"/>
+        <w:autoSpaceDN/>
+        <w:spacing w:after="160" w:line="278" w:lineRule="auto"/>
+        <w:ind w:firstLine="0"/>
+        <w:jc w:val="left"/>
+        <w:textAlignment w:val="auto"/>
+        <w:rPr>
+          <w:lang w:val="en-US"/>
+        </w:rPr>
+      </w:pPr>
+      <w:r>
+        <w:rPr>
+          <w:lang w:val="en-US"/>
+        </w:rPr>
+        <w:br w:type="page"/>
+      </w:r>
+    </w:p>
+    <w:p>
+      <w:pPr>
         <w:pStyle w:val="ae"/>
+      </w:pPr>
+      <w:bookmarkStart w:id="3" w:name="_Toc243733829"/>
+      <w:r>
         <w:rPr>
           <w:rFonts w:eastAsia="Times New Roman"/>
         </w:rPr>
-      </w:pPr>
-    </w:p>
-    <w:p/>
-    <w:p/>
-    <w:p/>
-    <w:p/>
-    <w:p/>
-    <w:p/>
-    <w:p/>
-    <w:p/>
-    <w:p/>
-    <w:p/>
-    <w:p/>
-    <w:p/>
-    <w:p/>
-    <w:p/>
-    <w:p/>
-    <w:p/>
-    <w:p/>
-    <w:p/>
-    <w:p/>
-    <w:p>
-      <w:pPr>
-        <w:pStyle w:val="ae"/>
-      </w:pPr>
-      <w:bookmarkStart w:id="2" w:name="_Toc243698026"/>
-      <w:r>
-        <w:rPr>
-          <w:rFonts w:eastAsia="Times New Roman"/>
-        </w:rPr>
+        <w:lastRenderedPageBreak/>
         <w:t xml:space="preserve">1. </w:t>
       </w:r>
       <w:r>
         <w:t>Постановка задачи</w:t>
       </w:r>
+      <w:bookmarkEnd w:id="2"/>
       <w:bookmarkEnd w:id="1"/>
-      <w:bookmarkEnd w:id="0"/>
-      <w:bookmarkEnd w:id="2"/>
+      <w:bookmarkEnd w:id="3"/>
     </w:p>
     <w:p>
       <w:pPr>
         <w:pStyle w:val="af1"/>
       </w:pPr>
-      <w:bookmarkStart w:id="3" w:name="_Toc243039470"/>
       <w:bookmarkStart w:id="4" w:name="_Toc243697833"/>
-      <w:bookmarkStart w:id="5" w:name="_Toc243698027"/>
+      <w:bookmarkStart w:id="5" w:name="_Toc243733830"/>
+      <w:bookmarkStart w:id="6" w:name="_Toc243039470"/>
       <w:r>
         <w:t>Цель:</w:t>
       </w:r>
@@ -802,21 +805,21 @@
       <w:r>
         <w:t>получить практические навыки по установке ПО.</w:t>
       </w:r>
-      <w:bookmarkEnd w:id="3"/>
+      <w:bookmarkEnd w:id="6"/>
     </w:p>
     <w:p>
       <w:pPr>
         <w:pStyle w:val="af1"/>
       </w:pPr>
-      <w:bookmarkStart w:id="6" w:name="_Toc243039471"/>
-      <w:bookmarkStart w:id="7" w:name="_Toc243697834"/>
-      <w:bookmarkStart w:id="8" w:name="_Toc243698028"/>
+      <w:bookmarkStart w:id="7" w:name="_Toc243039471"/>
+      <w:bookmarkStart w:id="8" w:name="_Toc243697834"/>
+      <w:bookmarkStart w:id="9" w:name="_Toc243733831"/>
       <w:r>
         <w:t>Задачи:</w:t>
       </w:r>
-      <w:bookmarkEnd w:id="6"/>
       <w:bookmarkEnd w:id="7"/>
       <w:bookmarkEnd w:id="8"/>
+      <w:bookmarkEnd w:id="9"/>
     </w:p>
     <w:p>
       <w:r>
@@ -837,32 +840,32 @@
       <w:pPr>
         <w:pStyle w:val="ae"/>
       </w:pPr>
-      <w:bookmarkStart w:id="9" w:name="_Toc243039472"/>
-      <w:bookmarkStart w:id="10" w:name="_Toc243697835"/>
-      <w:bookmarkStart w:id="11" w:name="_Toc243698029"/>
+      <w:bookmarkStart w:id="10" w:name="_Toc243039472"/>
+      <w:bookmarkStart w:id="11" w:name="_Toc243697835"/>
+      <w:bookmarkStart w:id="12" w:name="_Toc243733832"/>
       <w:r>
         <w:rPr>
           <w:rFonts w:eastAsia="Times New Roman"/>
         </w:rPr>
         <w:t>2. Ход работы</w:t>
       </w:r>
-      <w:bookmarkEnd w:id="9"/>
       <w:bookmarkEnd w:id="10"/>
       <w:bookmarkEnd w:id="11"/>
+      <w:bookmarkEnd w:id="12"/>
     </w:p>
     <w:p>
       <w:pPr>
         <w:pStyle w:val="af1"/>
       </w:pPr>
-      <w:bookmarkStart w:id="12" w:name="_Toc243039473"/>
-      <w:bookmarkStart w:id="13" w:name="_Toc243697836"/>
-      <w:bookmarkStart w:id="14" w:name="_Toc243698030"/>
+      <w:bookmarkStart w:id="13" w:name="_Toc243039473"/>
+      <w:bookmarkStart w:id="14" w:name="_Toc243697836"/>
+      <w:bookmarkStart w:id="15" w:name="_Toc243733833"/>
       <w:r>
         <w:t>Установка «1С Предприятие 8»</w:t>
       </w:r>
-      <w:bookmarkEnd w:id="12"/>
       <w:bookmarkEnd w:id="13"/>
       <w:bookmarkEnd w:id="14"/>
+      <w:bookmarkEnd w:id="15"/>
     </w:p>
     <w:p>
       <w:r>
@@ -870,6 +873,9 @@
       </w:r>
     </w:p>
     <w:p>
+      <w:pPr>
+        <w:jc w:val="center"/>
+      </w:pPr>
       <w:r>
         <w:rPr>
           <w:b/>
@@ -915,50 +921,51 @@
     </w:p>
     <w:p>
       <w:pPr>
-        <w:rPr>
-          <w:szCs w:val="28"/>
-        </w:rPr>
-      </w:pPr>
-      <w:r>
-        <w:rPr>
-          <w:szCs w:val="28"/>
+        <w:jc w:val="center"/>
+        <w:rPr>
+          <w:sz w:val="24"/>
+        </w:rPr>
+      </w:pPr>
+      <w:r>
+        <w:rPr>
+          <w:sz w:val="24"/>
         </w:rPr>
         <w:t xml:space="preserve">Рисунок </w:t>
       </w:r>
       <w:r>
         <w:rPr>
-          <w:szCs w:val="28"/>
+          <w:sz w:val="24"/>
         </w:rPr>
         <w:fldChar w:fldCharType="begin"/>
       </w:r>
       <w:r>
         <w:rPr>
-          <w:szCs w:val="28"/>
+          <w:sz w:val="24"/>
         </w:rPr>
         <w:instrText xml:space="preserve"> SEQ Рисунок \* ARABIC </w:instrText>
       </w:r>
       <w:r>
         <w:rPr>
-          <w:szCs w:val="28"/>
+          <w:sz w:val="24"/>
         </w:rPr>
         <w:fldChar w:fldCharType="separate"/>
       </w:r>
       <w:r>
         <w:rPr>
           <w:noProof/>
-          <w:szCs w:val="28"/>
+          <w:sz w:val="24"/>
         </w:rPr>
         <w:t>1</w:t>
       </w:r>
       <w:r>
         <w:rPr>
-          <w:szCs w:val="28"/>
+          <w:sz w:val="24"/>
         </w:rPr>
         <w:fldChar w:fldCharType="end"/>
       </w:r>
       <w:r>
         <w:rPr>
-          <w:szCs w:val="28"/>
+          <w:sz w:val="24"/>
         </w:rPr>
         <w:t xml:space="preserve"> - Ярлык "1С Предприятие (учебная версия)"</w:t>
       </w:r>
@@ -1065,15 +1072,15 @@
       <w:pPr>
         <w:pStyle w:val="af1"/>
       </w:pPr>
-      <w:bookmarkStart w:id="15" w:name="_Toc243039474"/>
-      <w:bookmarkStart w:id="16" w:name="_Toc243697837"/>
-      <w:bookmarkStart w:id="17" w:name="_Toc243698031"/>
+      <w:bookmarkStart w:id="16" w:name="_Toc243039474"/>
+      <w:bookmarkStart w:id="17" w:name="_Toc243697837"/>
+      <w:bookmarkStart w:id="18" w:name="_Toc243733834"/>
       <w:r>
         <w:t>Установка «1С: УНФ»</w:t>
       </w:r>
-      <w:bookmarkEnd w:id="15"/>
       <w:bookmarkEnd w:id="16"/>
       <w:bookmarkEnd w:id="17"/>
+      <w:bookmarkEnd w:id="18"/>
     </w:p>
     <w:p>
       <w:r>
@@ -1199,18 +1206,18 @@
       <w:pPr>
         <w:pStyle w:val="ae"/>
       </w:pPr>
-      <w:bookmarkStart w:id="18" w:name="_Toc243039475"/>
-      <w:bookmarkStart w:id="19" w:name="_Toc243697838"/>
-      <w:bookmarkStart w:id="20" w:name="_Toc243698032"/>
+      <w:bookmarkStart w:id="19" w:name="_Toc243039475"/>
+      <w:bookmarkStart w:id="20" w:name="_Toc243697838"/>
+      <w:bookmarkStart w:id="21" w:name="_Toc243733835"/>
       <w:r>
         <w:t xml:space="preserve">3. </w:t>
       </w:r>
       <w:r>
         <w:t>Вывод</w:t>
       </w:r>
-      <w:bookmarkEnd w:id="18"/>
       <w:bookmarkEnd w:id="19"/>
       <w:bookmarkEnd w:id="20"/>
+      <w:bookmarkEnd w:id="21"/>
     </w:p>
     <w:p>
       <w:r>
@@ -1229,12 +1236,17 @@
       </w:r>
     </w:p>
     <w:p>
-      <w:pPr>
-        <w:rPr>
-          <w:b/>
-          <w:bCs/>
-        </w:rPr>
-      </w:pPr>
+      <w:r>
+        <w:t>Также в процессе работы были изучены основные этапы развертывания прикладных решений на платформе «1</w:t>
+      </w:r>
+      <w:proofErr w:type="gramStart"/>
+      <w:r>
+        <w:t>С:Предприятие</w:t>
+      </w:r>
+      <w:proofErr w:type="gramEnd"/>
+      <w:r>
+        <w:t xml:space="preserve"> 8»: от скачивания дистрибутива до создания информационной базы из шаблона. Освоен интерфейс запускающего окна и алгоритм добавления новой базы, что является базовым навыком, необходимым для дальнейшего выполнения практических заданий по настройке и ведению учета в конфигурации «Управление нашей фирмой». Полученные знания позволяют самостоятельно подготовить рабочее место для работы с учебной версией программы.</w:t>
+      </w:r>
     </w:p>
     <w:sectPr>
       <w:footerReference w:type="default" r:id="rId11"/>
@@ -1664,7 +1676,7 @@
     <w:lsdException w:name="footnote text" w:semiHidden="1" w:unhideWhenUsed="1"/>
     <w:lsdException w:name="annotation text" w:semiHidden="1" w:unhideWhenUsed="1"/>
     <w:lsdException w:name="header" w:semiHidden="1" w:unhideWhenUsed="1"/>
-    <w:lsdException w:name="footer" w:semiHidden="1" w:unhideWhenUsed="1"/>
+    <w:lsdException w:name="footer" w:semiHidden="1" w:uiPriority="0" w:unhideWhenUsed="1"/>
     <w:lsdException w:name="index heading" w:semiHidden="1" w:unhideWhenUsed="1"/>
     <w:lsdException w:name="caption" w:semiHidden="1" w:uiPriority="0" w:unhideWhenUsed="1" w:qFormat="1"/>
     <w:lsdException w:name="table of figures" w:semiHidden="1" w:unhideWhenUsed="1"/>
@@ -1706,7 +1718,7 @@
     <w:lsdException w:name="List Continue 4" w:semiHidden="1" w:unhideWhenUsed="1"/>
     <w:lsdException w:name="List Continue 5" w:semiHidden="1" w:unhideWhenUsed="1"/>
     <w:lsdException w:name="Message Header" w:semiHidden="1" w:unhideWhenUsed="1"/>
-    <w:lsdException w:name="Subtitle" w:uiPriority="11" w:qFormat="1"/>
+    <w:lsdException w:name="Subtitle" w:uiPriority="0" w:qFormat="1"/>
     <w:lsdException w:name="Salutation" w:semiHidden="1" w:unhideWhenUsed="1"/>
     <w:lsdException w:name="Date" w:semiHidden="1" w:unhideWhenUsed="1"/>
     <w:lsdException w:name="Body Text First Indent" w:semiHidden="1" w:unhideWhenUsed="1"/>
@@ -2012,7 +2024,7 @@
   <w:style w:type="paragraph" w:default="1" w:styleId="a">
     <w:name w:val="Normal"/>
     <w:qFormat/>
-    <w:rsid w:val="00C36650"/>
+    <w:rsid w:val="00214306"/>
     <w:pPr>
       <w:suppressAutoHyphens/>
       <w:autoSpaceDN w:val="0"/>
@@ -2036,7 +2048,7 @@
     <w:link w:val="10"/>
     <w:uiPriority w:val="9"/>
     <w:qFormat/>
-    <w:rsid w:val="00C36650"/>
+    <w:rsid w:val="00214306"/>
     <w:pPr>
       <w:keepNext/>
       <w:keepLines/>
@@ -2059,7 +2071,7 @@
     <w:semiHidden/>
     <w:unhideWhenUsed/>
     <w:qFormat/>
-    <w:rsid w:val="00C36650"/>
+    <w:rsid w:val="00214306"/>
     <w:pPr>
       <w:keepNext/>
       <w:keepLines/>
@@ -2228,7 +2240,7 @@
     <w:name w:val="Default Paragraph Font"/>
     <w:uiPriority w:val="1"/>
     <w:unhideWhenUsed/>
-    <w:rsid w:val="00C36650"/>
+    <w:rsid w:val="00214306"/>
   </w:style>
   <w:style w:type="table" w:default="1" w:styleId="a1">
     <w:name w:val="Normal Table"/>
@@ -2250,14 +2262,14 @@
     <w:uiPriority w:val="99"/>
     <w:semiHidden/>
     <w:unhideWhenUsed/>
-    <w:rsid w:val="00C36650"/>
+    <w:rsid w:val="00214306"/>
   </w:style>
   <w:style w:type="character" w:customStyle="1" w:styleId="10">
     <w:name w:val="Заголовок 1 Знак"/>
     <w:basedOn w:val="a0"/>
     <w:link w:val="1"/>
     <w:uiPriority w:val="9"/>
-    <w:rsid w:val="00C36650"/>
+    <w:rsid w:val="00214306"/>
     <w:rPr>
       <w:rFonts w:asciiTheme="majorHAnsi" w:eastAsiaTheme="majorEastAsia" w:hAnsiTheme="majorHAnsi" w:cs="Mangal"/>
       <w:color w:val="0F4761" w:themeColor="accent1" w:themeShade="BF"/>
@@ -2274,7 +2286,7 @@
     <w:link w:val="2"/>
     <w:uiPriority w:val="9"/>
     <w:semiHidden/>
-    <w:rsid w:val="00C36650"/>
+    <w:rsid w:val="00214306"/>
     <w:rPr>
       <w:rFonts w:asciiTheme="majorHAnsi" w:eastAsiaTheme="majorEastAsia" w:hAnsiTheme="majorHAnsi" w:cs="Mangal"/>
       <w:color w:val="0F4761" w:themeColor="accent1" w:themeShade="BF"/>
@@ -2385,7 +2397,7 @@
     <w:autoRedefine/>
     <w:uiPriority w:val="10"/>
     <w:qFormat/>
-    <w:rsid w:val="00C36650"/>
+    <w:rsid w:val="00214306"/>
     <w:pPr>
       <w:spacing w:before="0"/>
       <w:contextualSpacing/>
@@ -2406,7 +2418,7 @@
     <w:basedOn w:val="a0"/>
     <w:link w:val="a3"/>
     <w:uiPriority w:val="10"/>
-    <w:rsid w:val="00C36650"/>
+    <w:rsid w:val="00214306"/>
     <w:rPr>
       <w:rFonts w:ascii="Times New Roman" w:eastAsiaTheme="majorEastAsia" w:hAnsi="Times New Roman" w:cs="Mangal"/>
       <w:b/>
@@ -2423,40 +2435,36 @@
     <w:basedOn w:val="2"/>
     <w:next w:val="a"/>
     <w:link w:val="a6"/>
-    <w:autoRedefine/>
-    <w:uiPriority w:val="11"/>
     <w:qFormat/>
-    <w:rsid w:val="00C36650"/>
+    <w:rsid w:val="00214306"/>
     <w:pPr>
-      <w:numPr>
-        <w:ilvl w:val="1"/>
-      </w:numPr>
       <w:spacing w:before="0"/>
+      <w:ind w:firstLine="0"/>
       <w:jc w:val="left"/>
     </w:pPr>
     <w:rPr>
-      <w:rFonts w:ascii="Times New Roman" w:eastAsiaTheme="minorEastAsia" w:hAnsi="Times New Roman"/>
+      <w:rFonts w:ascii="Times New Roman" w:eastAsia="Times New Roman" w:hAnsi="Times New Roman"/>
       <w:b/>
+      <w:bCs/>
       <w:color w:val="000000" w:themeColor="text1"/>
       <w:spacing w:val="15"/>
       <w:sz w:val="28"/>
-      <w:szCs w:val="20"/>
     </w:rPr>
   </w:style>
   <w:style w:type="character" w:customStyle="1" w:styleId="a6">
     <w:name w:val="Подзаголовок Знак"/>
     <w:basedOn w:val="a0"/>
     <w:link w:val="a5"/>
-    <w:uiPriority w:val="11"/>
-    <w:rsid w:val="00C36650"/>
-    <w:rPr>
-      <w:rFonts w:ascii="Times New Roman" w:eastAsiaTheme="minorEastAsia" w:hAnsi="Times New Roman" w:cs="Mangal"/>
+    <w:rsid w:val="00214306"/>
+    <w:rPr>
+      <w:rFonts w:ascii="Times New Roman" w:eastAsia="Times New Roman" w:hAnsi="Times New Roman" w:cs="Mangal"/>
       <w:b/>
+      <w:bCs/>
       <w:color w:val="000000" w:themeColor="text1"/>
       <w:spacing w:val="15"/>
       <w:kern w:val="3"/>
       <w:sz w:val="28"/>
-      <w:szCs w:val="20"/>
+      <w:szCs w:val="23"/>
       <w:lang w:eastAsia="zh-CN" w:bidi="hi-IN"/>
       <w14:ligatures w14:val="none"/>
     </w:rPr>
@@ -2569,7 +2577,7 @@
     <w:uiPriority w:val="39"/>
     <w:unhideWhenUsed/>
     <w:qFormat/>
-    <w:rsid w:val="00C36650"/>
+    <w:rsid w:val="00214306"/>
     <w:pPr>
       <w:suppressAutoHyphens w:val="0"/>
       <w:autoSpaceDN/>
@@ -2587,7 +2595,7 @@
   <w:style w:type="paragraph" w:styleId="ad">
     <w:name w:val="caption"/>
     <w:basedOn w:val="Standard"/>
-    <w:rsid w:val="00C36650"/>
+    <w:rsid w:val="00214306"/>
     <w:pPr>
       <w:suppressLineNumbers/>
       <w:spacing w:before="120" w:after="120"/>
@@ -2634,7 +2642,7 @@
     <w:autoRedefine/>
     <w:uiPriority w:val="39"/>
     <w:unhideWhenUsed/>
-    <w:rsid w:val="00C36650"/>
+    <w:rsid w:val="00214306"/>
     <w:pPr>
       <w:spacing w:after="100"/>
     </w:pPr>
@@ -2648,7 +2656,7 @@
     <w:basedOn w:val="a0"/>
     <w:uiPriority w:val="99"/>
     <w:unhideWhenUsed/>
-    <w:rsid w:val="00C36650"/>
+    <w:rsid w:val="00214306"/>
     <w:rPr>
       <w:color w:val="467886" w:themeColor="hyperlink"/>
       <w:u w:val="single"/>
@@ -2682,7 +2690,7 @@
     <w:rPr>
       <w:rFonts w:ascii="Times New Roman" w:eastAsia="Times New Roman" w:hAnsi="Times New Roman" w:cs="Mangal"/>
       <w:b/>
-      <w:bCs/>
+      <w:bCs w:val="0"/>
       <w:color w:val="000000" w:themeColor="text1"/>
       <w:spacing w:val="15"/>
       <w:kern w:val="3"/>
@@ -2699,7 +2707,7 @@
     <w:autoRedefine/>
     <w:uiPriority w:val="39"/>
     <w:unhideWhenUsed/>
-    <w:rsid w:val="00C36650"/>
+    <w:rsid w:val="00214306"/>
     <w:pPr>
       <w:spacing w:after="100"/>
       <w:ind w:left="240"/>
@@ -2729,7 +2737,7 @@
   </w:style>
   <w:style w:type="paragraph" w:customStyle="1" w:styleId="Standard">
     <w:name w:val="Standard"/>
-    <w:rsid w:val="00C36650"/>
+    <w:rsid w:val="00214306"/>
     <w:pPr>
       <w:suppressAutoHyphens/>
       <w:autoSpaceDN w:val="0"/>
@@ -2747,7 +2755,7 @@
     <w:name w:val="Heading"/>
     <w:basedOn w:val="Standard"/>
     <w:next w:val="Textbody"/>
-    <w:rsid w:val="00C36650"/>
+    <w:rsid w:val="00214306"/>
     <w:pPr>
       <w:keepNext/>
       <w:spacing w:before="240" w:after="120"/>
@@ -2761,7 +2769,7 @@
   <w:style w:type="paragraph" w:customStyle="1" w:styleId="Textbody">
     <w:name w:val="Text body"/>
     <w:basedOn w:val="Standard"/>
-    <w:rsid w:val="00C36650"/>
+    <w:rsid w:val="00214306"/>
     <w:pPr>
       <w:spacing w:after="140" w:line="276" w:lineRule="auto"/>
     </w:pPr>
@@ -2769,12 +2777,12 @@
   <w:style w:type="paragraph" w:styleId="af3">
     <w:name w:val="List"/>
     <w:basedOn w:val="Textbody"/>
-    <w:rsid w:val="00C36650"/>
+    <w:rsid w:val="00214306"/>
   </w:style>
   <w:style w:type="paragraph" w:customStyle="1" w:styleId="Index">
     <w:name w:val="Index"/>
     <w:basedOn w:val="Standard"/>
-    <w:rsid w:val="00C36650"/>
+    <w:rsid w:val="00214306"/>
     <w:pPr>
       <w:suppressLineNumbers/>
     </w:pPr>
@@ -2782,7 +2790,7 @@
   <w:style w:type="paragraph" w:customStyle="1" w:styleId="HeaderandFooter">
     <w:name w:val="Header and Footer"/>
     <w:basedOn w:val="Standard"/>
-    <w:rsid w:val="00C36650"/>
+    <w:rsid w:val="00214306"/>
     <w:pPr>
       <w:suppressLineNumbers/>
       <w:tabs>
@@ -2795,14 +2803,12 @@
     <w:name w:val="footer"/>
     <w:basedOn w:val="HeaderandFooter"/>
     <w:link w:val="af5"/>
-    <w:uiPriority w:val="99"/>
-    <w:rsid w:val="00C36650"/>
+    <w:rsid w:val="00214306"/>
   </w:style>
   <w:style w:type="character" w:customStyle="1" w:styleId="af5">
     <w:name w:val="Нижний колонтитул Знак"/>
     <w:basedOn w:val="a0"/>
     <w:link w:val="af4"/>
-    <w:uiPriority w:val="99"/>
     <w:rsid w:val="00C36650"/>
     <w:rPr>
       <w:rFonts w:ascii="Liberation Serif" w:eastAsia="NSimSun" w:hAnsi="Liberation Serif" w:cs="Arial"/>
@@ -2814,16 +2820,16 @@
   <w:style w:type="paragraph" w:customStyle="1" w:styleId="Drawing">
     <w:name w:val="Drawing"/>
     <w:basedOn w:val="ad"/>
-    <w:rsid w:val="00C36650"/>
+    <w:rsid w:val="00214306"/>
   </w:style>
   <w:style w:type="character" w:customStyle="1" w:styleId="NumberingSymbols">
     <w:name w:val="Numbering Symbols"/>
-    <w:rsid w:val="00C36650"/>
+    <w:rsid w:val="00214306"/>
   </w:style>
   <w:style w:type="numbering" w:customStyle="1" w:styleId="Numbering123">
     <w:name w:val="Numbering 123"/>
     <w:basedOn w:val="a2"/>
-    <w:rsid w:val="00C36650"/>
+    <w:rsid w:val="00214306"/>
     <w:pPr>
       <w:numPr>
         <w:numId w:val="3"/>

</xml_diff>